<commit_message>
add rob to results
</commit_message>
<xml_diff>
--- a/manuscript/analysis_results.docx
+++ b/manuscript/analysis_results.docx
@@ -10,7 +10,7 @@
         <w:t xml:space="preserve">Analysis and Results</w:t>
       </w:r>
     </w:p>
-    <w:bookmarkStart w:id="23" w:name="statistical-analysis"/>
+    <w:bookmarkStart w:id="12" w:name="statistical-analysis"/>
     <w:p>
       <w:pPr>
         <w:pStyle w:val="Heading1"/>
@@ -27,7 +27,7 @@
         <w:t xml:space="preserve">Statistical analysis of the data extracted was performed in R (R version 4.5.2 (2025-10-31 ucrt); R Core Team, https://www.r-project.org/) and RStudio (version 2026.01.1; Posit, https://posit.co/). All of the data, code, packages, and pipeline utilized for the data preparation and analyses is available on the Open Science Framework page for this project (https://osf.io/y275k/overview) and the corresponding GitHub repository (https://github.com/jamessteeleii/exercise_recovery_modalities_meta). Though pre-registered (see https://osf.io/qkpbm/overview) the present analysis is considered exploratory and aimed at effect estimation within a Bayesian meta-analytic framework. For all analyses, the model estimates and their precision, along with conclusions based upon them, are interpreted continuously and probabilistically, considering the data quality, the plausibility of effect, and the previous literature, all within the context of each model.</w:t>
       </w:r>
     </w:p>
-    <w:bookmarkStart w:id="20" w:name="effect-sizes"/>
+    <w:bookmarkStart w:id="9" w:name="effect-sizes"/>
     <w:p>
       <w:pPr>
         <w:pStyle w:val="Heading2"/>
@@ -68,8 +68,8 @@
         <w:t xml:space="preserve">given that many of the perceptual outcomes had ~0 variance at pre-exercise.</w:t>
       </w:r>
     </w:p>
-    <w:bookmarkEnd w:id="20"/>
-    <w:bookmarkStart w:id="22" w:name="meta-analysis-model"/>
+    <w:bookmarkEnd w:id="9"/>
+    <w:bookmarkStart w:id="11" w:name="meta-analysis-model"/>
     <w:p>
       <w:pPr>
         <w:pStyle w:val="Heading2"/>
@@ -190,7 +190,7 @@
       <w:r>
         <w:t xml:space="preserve"> </w:t>
       </w:r>
-      <w:hyperlink r:id="rId21">
+      <w:hyperlink r:id="rId10">
         <w:r>
           <w:rPr>
             <w:rStyle w:val="Hyperlink"/>
@@ -202,9 +202,9 @@
         <w:t xml:space="preserve">).</w:t>
       </w:r>
     </w:p>
-    <w:bookmarkEnd w:id="22"/>
-    <w:bookmarkEnd w:id="23"/>
-    <w:bookmarkStart w:id="39" w:name="results"/>
+    <w:bookmarkEnd w:id="11"/>
+    <w:bookmarkEnd w:id="12"/>
+    <w:bookmarkStart w:id="33" w:name="results"/>
     <w:p>
       <w:pPr>
         <w:pStyle w:val="Heading1"/>
@@ -213,35 +213,13 @@
         <w:t xml:space="preserve">Results</w:t>
       </w:r>
     </w:p>
-    <w:bookmarkStart w:id="28" w:name="performance-outcomes"/>
+    <w:bookmarkStart w:id="17" w:name="risk-of-bias"/>
     <w:p>
       <w:pPr>
         <w:pStyle w:val="Heading2"/>
       </w:pPr>
       <w:r>
-        <w:t xml:space="preserve">Performance Outcomes</w:t>
-      </w:r>
-    </w:p>
-    <w:p>
-      <w:pPr>
-        <w:pStyle w:val="FirstParagraph"/>
-      </w:pPr>
-      <w:r>
-        <w:t xml:space="preserve">The model examining performance outcomes included 38 studies containing 72 separate arms reporting 654 within arm effects. The breakdown of recovery modality conditions included was 27 control, 10 placebo, 11 active, 7 blood flow restriction, 26 cold, 3 heat, 4 contrast, 6 compression, and 2 massage. Global grand mean estimates for both predicted values and contrasts against the reference condition of non-intervention control are shown in</w:t>
-      </w:r>
-      <w:r>
-        <w:t xml:space="preserve"> </w:t>
-      </w:r>
-      <w:hyperlink w:anchor="fig-performance">
-        <w:r>
-          <w:rPr>
-            <w:rStyle w:val="Hyperlink"/>
-          </w:rPr>
-          <w:t xml:space="preserve">Figure 1</w:t>
-        </w:r>
-      </w:hyperlink>
-      <w:r>
-        <w:t xml:space="preserve">. Across all modalities performance had recovered to pre-exercise values from ~72-120 hours post-exercise with no modality resulting in clearly better recovery compared to non-intervention controls.</w:t>
+        <w:t xml:space="preserve">Risk of Bias</w:t>
       </w:r>
     </w:p>
     <w:tbl>
@@ -257,7 +235,176 @@
       <w:tr>
         <w:tc>
           <w:tcPr/>
-          <w:bookmarkStart w:id="27" w:name="fig-performance"/>
+          <w:bookmarkStart w:id="16" w:name="fig-rob2"/>
+          <w:p>
+            <w:pPr>
+              <w:pStyle w:val="Compact"/>
+              <w:jc w:val="center"/>
+            </w:pPr>
+            <w:r>
+              <w:drawing>
+                <wp:inline>
+                  <wp:extent cx="5334000" cy="4000500"/>
+                  <wp:effectExtent b="0" l="0" r="0" t="0"/>
+                  <wp:docPr descr="" title="" id="14" name="Picture"/>
+                  <a:graphic>
+                    <a:graphicData uri="http://schemas.openxmlformats.org/drawingml/2006/picture">
+                      <pic:pic>
+                        <pic:nvPicPr>
+                          <pic:cNvPr descr="analysis_results_files/figure-docx/fig-rob2-1.png" id="15" name="Picture"/>
+                          <pic:cNvPicPr>
+                            <a:picLocks noChangeArrowheads="1" noChangeAspect="1"/>
+                          </pic:cNvPicPr>
+                        </pic:nvPicPr>
+                        <pic:blipFill>
+                          <a:blip r:embed="rId13"/>
+                          <a:stretch>
+                            <a:fillRect/>
+                          </a:stretch>
+                        </pic:blipFill>
+                        <pic:spPr bwMode="auto">
+                          <a:xfrm>
+                            <a:off x="0" y="0"/>
+                            <a:ext cx="5334000" cy="4000500"/>
+                          </a:xfrm>
+                          <a:prstGeom prst="rect">
+                            <a:avLst/>
+                          </a:prstGeom>
+                          <a:noFill/>
+                          <a:ln w="9525">
+                            <a:noFill/>
+                            <a:headEnd/>
+                            <a:tailEnd/>
+                          </a:ln>
+                        </pic:spPr>
+                      </pic:pic>
+                    </a:graphicData>
+                  </a:graphic>
+                </wp:inline>
+              </w:drawing>
+            </w:r>
+          </w:p>
+          <w:p>
+            <w:pPr>
+              <w:jc w:val="center"/>
+            </w:pPr>
+            <w:pPr>
+              <w:jc w:val="left"/>
+              <w:spacing w:before="200"/>
+              <w:pStyle w:val="ImageCaption"/>
+            </w:pPr>
+            <w:r>
+              <w:t xml:space="preserve">Figure 1: Risk of Bias 2.0 summary for independent arm (i.e., between group) studies (top panel) and dependent arm (i.e., crossover) studies (bottom panel).</w:t>
+            </w:r>
+          </w:p>
+          <w:bookmarkEnd w:id="16"/>
+        </w:tc>
+      </w:tr>
+    </w:tbl>
+    <w:p>
+      <w:pPr>
+        <w:pStyle w:val="BodyText"/>
+      </w:pPr>
+      <w:r>
+        <w:t xml:space="preserve">The summary for the risk of bias assessment can be seen in</w:t>
+      </w:r>
+      <w:r>
+        <w:t xml:space="preserve"> </w:t>
+      </w:r>
+      <w:hyperlink w:anchor="fig-rob2">
+        <w:r>
+          <w:rPr>
+            <w:rStyle w:val="Hyperlink"/>
+          </w:rPr>
+          <w:t xml:space="preserve">Figure 1</w:t>
+        </w:r>
+      </w:hyperlink>
+      <w:r>
+        <w:t xml:space="preserve">. Whilst individual domains typically showed</w:t>
+      </w:r>
+      <w:r>
+        <w:t xml:space="preserve"> </w:t>
+      </w:r>
+      <w:r>
+        <w:t xml:space="preserve">“Low”</w:t>
+      </w:r>
+      <w:r>
+        <w:t xml:space="preserve"> </w:t>
+      </w:r>
+      <w:r>
+        <w:t xml:space="preserve">risk of bias in isolation at least half of all dependent arm studies, and more than half of all independent arm studies, were classified overall as either having</w:t>
+      </w:r>
+      <w:r>
+        <w:t xml:space="preserve"> </w:t>
+      </w:r>
+      <w:r>
+        <w:t xml:space="preserve">“Some concerns”</w:t>
+      </w:r>
+      <w:r>
+        <w:t xml:space="preserve"> </w:t>
+      </w:r>
+      <w:r>
+        <w:t xml:space="preserve">or</w:t>
+      </w:r>
+      <w:r>
+        <w:t xml:space="preserve"> </w:t>
+      </w:r>
+      <w:r>
+        <w:t xml:space="preserve">“High”</w:t>
+      </w:r>
+      <w:r>
+        <w:t xml:space="preserve"> </w:t>
+      </w:r>
+      <w:r>
+        <w:t xml:space="preserve">risk of bias.</w:t>
+      </w:r>
+    </w:p>
+    <w:bookmarkEnd w:id="17"/>
+    <w:bookmarkStart w:id="22" w:name="performance-outcomes"/>
+    <w:p>
+      <w:pPr>
+        <w:pStyle w:val="Heading2"/>
+      </w:pPr>
+      <w:r>
+        <w:t xml:space="preserve">Performance Outcomes</w:t>
+      </w:r>
+    </w:p>
+    <w:p>
+      <w:pPr>
+        <w:pStyle w:val="FirstParagraph"/>
+      </w:pPr>
+      <w:r>
+        <w:t xml:space="preserve">The model examining performance outcomes included 38 studies containing 72 separate arms reporting 654 within arm effects. The breakdown of recovery modality conditions included was 27 control, 10 placebo, 11 active, 7 blood flow restriction, 26 cold, 3 heat, 4 contrast, 6 compression, and 2 massage. Global grand mean estimates for both predicted values and contrasts against the reference condition of non-intervention control are shown in</w:t>
+      </w:r>
+      <w:r>
+        <w:t xml:space="preserve"> </w:t>
+      </w:r>
+      <w:hyperlink w:anchor="fig-performance">
+        <w:r>
+          <w:rPr>
+            <w:rStyle w:val="Hyperlink"/>
+          </w:rPr>
+          <w:t xml:space="preserve">Figure 2</w:t>
+        </w:r>
+      </w:hyperlink>
+      <w:r>
+        <w:t xml:space="preserve">. Across all modalities performance had recovered to pre-exercise values from ~72-120 hours post-exercise with no modality resulting in clearly better recovery compared to non-intervention controls.</w:t>
+      </w:r>
+    </w:p>
+    <w:tbl>
+      <w:tblPr>
+        <w:tblStyle w:val="Table"/>
+        <w:tblW w:type="pct" w:w="5000"/>
+        <w:tblLayout w:type="fixed"/>
+        <w:tblLook w:firstRow="0" w:lastRow="0" w:firstColumn="0" w:lastColumn="0" w:noHBand="0" w:noVBand="0" w:val="0000"/>
+      </w:tblPr>
+      <w:tblGrid>
+        <w:gridCol w:w="7920"/>
+      </w:tblGrid>
+      <w:tr>
+        <w:tc>
+          <w:tcPr/>
+          <w:bookmarkStart w:id="21" w:name="fig-performance"/>
           <w:p>
             <w:pPr>
               <w:pStyle w:val="Compact"/>
@@ -268,18 +415,18 @@
                 <wp:inline>
                   <wp:extent cx="5334000" cy="3200400"/>
                   <wp:effectExtent b="0" l="0" r="0" t="0"/>
-                  <wp:docPr descr="" title="" id="25" name="Picture"/>
+                  <wp:docPr descr="" title="" id="19" name="Picture"/>
                   <a:graphic>
                     <a:graphicData uri="http://schemas.openxmlformats.org/drawingml/2006/picture">
                       <pic:pic>
                         <pic:nvPicPr>
-                          <pic:cNvPr descr="analysis_results_files/figure-docx/fig-performance-1.png" id="26" name="Picture"/>
+                          <pic:cNvPr descr="analysis_results_files/figure-docx/fig-performance-1.png" id="20" name="Picture"/>
                           <pic:cNvPicPr>
                             <a:picLocks noChangeArrowheads="1" noChangeAspect="1"/>
                           </pic:cNvPicPr>
                         </pic:nvPicPr>
                         <pic:blipFill>
-                          <a:blip r:embed="rId24"/>
+                          <a:blip r:embed="rId18"/>
                           <a:stretch>
                             <a:fillRect/>
                           </a:stretch>
@@ -316,15 +463,15 @@
               <w:pStyle w:val="ImageCaption"/>
             </w:pPr>
             <w:r>
-              <w:t xml:space="preserve">Figure 1: Global grand means for predictions and contrasts from meta-analysis of performance outcomes across recovery modality conditions over time post-exercise. Left panel shows predicted values for fatigue and subsequent recovery, right panel shows the comparison of fatigue/recovery between each recovery modality and non-intervention controls.</w:t>
+              <w:t xml:space="preserve">Figure 2: Global grand means for predictions and contrasts from meta-analysis of performance outcomes across recovery modality conditions over time post-exercise. Left panel shows predicted values for fatigue and subsequent recovery, right panel shows the comparison of fatigue/recovery between each recovery modality and non-intervention controls.</w:t>
             </w:r>
           </w:p>
-          <w:bookmarkEnd w:id="27"/>
+          <w:bookmarkEnd w:id="21"/>
         </w:tc>
       </w:tr>
     </w:tbl>
-    <w:bookmarkEnd w:id="28"/>
-    <w:bookmarkStart w:id="33" w:name="biochemical-outcomes"/>
+    <w:bookmarkEnd w:id="22"/>
+    <w:bookmarkStart w:id="27" w:name="biochemical-outcomes"/>
     <w:p>
       <w:pPr>
         <w:pStyle w:val="Heading2"/>
@@ -348,7 +495,7 @@
           <w:rPr>
             <w:rStyle w:val="Hyperlink"/>
           </w:rPr>
-          <w:t xml:space="preserve">Figure 2</w:t>
+          <w:t xml:space="preserve">Figure 3</w:t>
         </w:r>
       </w:hyperlink>
       <w:r>
@@ -368,7 +515,7 @@
       <w:tr>
         <w:tc>
           <w:tcPr/>
-          <w:bookmarkStart w:id="32" w:name="fig-biochemical"/>
+          <w:bookmarkStart w:id="26" w:name="fig-biochemical"/>
           <w:p>
             <w:pPr>
               <w:pStyle w:val="Compact"/>
@@ -379,18 +526,18 @@
                 <wp:inline>
                   <wp:extent cx="5334000" cy="3200400"/>
                   <wp:effectExtent b="0" l="0" r="0" t="0"/>
-                  <wp:docPr descr="" title="" id="30" name="Picture"/>
+                  <wp:docPr descr="" title="" id="24" name="Picture"/>
                   <a:graphic>
                     <a:graphicData uri="http://schemas.openxmlformats.org/drawingml/2006/picture">
                       <pic:pic>
                         <pic:nvPicPr>
-                          <pic:cNvPr descr="analysis_results_files/figure-docx/fig-biochemical-1.png" id="31" name="Picture"/>
+                          <pic:cNvPr descr="analysis_results_files/figure-docx/fig-biochemical-1.png" id="25" name="Picture"/>
                           <pic:cNvPicPr>
                             <a:picLocks noChangeArrowheads="1" noChangeAspect="1"/>
                           </pic:cNvPicPr>
                         </pic:nvPicPr>
                         <pic:blipFill>
-                          <a:blip r:embed="rId29"/>
+                          <a:blip r:embed="rId23"/>
                           <a:stretch>
                             <a:fillRect/>
                           </a:stretch>
@@ -427,15 +574,15 @@
               <w:pStyle w:val="ImageCaption"/>
             </w:pPr>
             <w:r>
-              <w:t xml:space="preserve">Figure 2: Global grand means for predictions and contrasts from meta-analysis of biochemical outcomes across recovery modality conditions over time post-exercise. Left panel shows predicted values for fatigue and subsequent recovery, right panel shows the comparison of fatigue/recovery between each recovery modality and non-intervention controls.</w:t>
+              <w:t xml:space="preserve">Figure 3: Global grand means for predictions and contrasts from meta-analysis of biochemical outcomes across recovery modality conditions over time post-exercise. Left panel shows predicted values for fatigue and subsequent recovery, right panel shows the comparison of fatigue/recovery between each recovery modality and non-intervention controls.</w:t>
             </w:r>
           </w:p>
-          <w:bookmarkEnd w:id="32"/>
+          <w:bookmarkEnd w:id="26"/>
         </w:tc>
       </w:tr>
     </w:tbl>
-    <w:bookmarkEnd w:id="33"/>
-    <w:bookmarkStart w:id="38" w:name="perceptual-outcomes"/>
+    <w:bookmarkEnd w:id="27"/>
+    <w:bookmarkStart w:id="32" w:name="perceptual-outcomes"/>
     <w:p>
       <w:pPr>
         <w:pStyle w:val="Heading2"/>
@@ -459,7 +606,7 @@
           <w:rPr>
             <w:rStyle w:val="Hyperlink"/>
           </w:rPr>
-          <w:t xml:space="preserve">Figure 3</w:t>
+          <w:t xml:space="preserve">Figure 4</w:t>
         </w:r>
       </w:hyperlink>
       <w:r>
@@ -479,7 +626,7 @@
       <w:tr>
         <w:tc>
           <w:tcPr/>
-          <w:bookmarkStart w:id="37" w:name="fig-perceptual"/>
+          <w:bookmarkStart w:id="31" w:name="fig-perceptual"/>
           <w:p>
             <w:pPr>
               <w:pStyle w:val="Compact"/>
@@ -490,18 +637,18 @@
                 <wp:inline>
                   <wp:extent cx="5334000" cy="3200400"/>
                   <wp:effectExtent b="0" l="0" r="0" t="0"/>
-                  <wp:docPr descr="" title="" id="35" name="Picture"/>
+                  <wp:docPr descr="" title="" id="29" name="Picture"/>
                   <a:graphic>
                     <a:graphicData uri="http://schemas.openxmlformats.org/drawingml/2006/picture">
                       <pic:pic>
                         <pic:nvPicPr>
-                          <pic:cNvPr descr="analysis_results_files/figure-docx/fig-perceptual-1.png" id="36" name="Picture"/>
+                          <pic:cNvPr descr="analysis_results_files/figure-docx/fig-perceptual-1.png" id="30" name="Picture"/>
                           <pic:cNvPicPr>
                             <a:picLocks noChangeArrowheads="1" noChangeAspect="1"/>
                           </pic:cNvPicPr>
                         </pic:nvPicPr>
                         <pic:blipFill>
-                          <a:blip r:embed="rId34"/>
+                          <a:blip r:embed="rId28"/>
                           <a:stretch>
                             <a:fillRect/>
                           </a:stretch>
@@ -538,16 +685,16 @@
               <w:pStyle w:val="ImageCaption"/>
             </w:pPr>
             <w:r>
-              <w:t xml:space="preserve">Figure 3: Global grand means for predictions and contrasts from meta-analysis of perceptual outcomes across recovery modality conditions over time post-exercise. Left panel shows predicted values for fatigue and subsequent recovery, right panel shows the comparison of fatigue/recovery between each recovery modality and non-intervention controls.</w:t>
+              <w:t xml:space="preserve">Figure 4: Global grand means for predictions and contrasts from meta-analysis of perceptual outcomes across recovery modality conditions over time post-exercise. Left panel shows predicted values for fatigue and subsequent recovery, right panel shows the comparison of fatigue/recovery between each recovery modality and non-intervention controls.</w:t>
             </w:r>
           </w:p>
-          <w:bookmarkEnd w:id="37"/>
+          <w:bookmarkEnd w:id="31"/>
         </w:tc>
       </w:tr>
     </w:tbl>
-    <w:bookmarkEnd w:id="38"/>
-    <w:bookmarkEnd w:id="39"/>
-    <w:bookmarkStart w:id="45" w:name="references"/>
+    <w:bookmarkEnd w:id="32"/>
+    <w:bookmarkEnd w:id="33"/>
+    <w:bookmarkStart w:id="39" w:name="references"/>
     <w:p>
       <w:pPr>
         <w:pStyle w:val="Heading1"/>
@@ -556,8 +703,8 @@
         <w:t xml:space="preserve">References</w:t>
       </w:r>
     </w:p>
-    <w:bookmarkStart w:id="44" w:name="refs"/>
-    <w:bookmarkStart w:id="41" w:name="Xb1f908e9c2fec413b0337dc08ef7717b94bcd98"/>
+    <w:bookmarkStart w:id="38" w:name="refs"/>
+    <w:bookmarkStart w:id="35" w:name="Xb1f908e9c2fec413b0337dc08ef7717b94bcd98"/>
     <w:p>
       <w:pPr>
         <w:pStyle w:val="Bibliography"/>
@@ -587,7 +734,7 @@
       <w:r>
         <w:t xml:space="preserve">. 1988;41(2):257-278. doi:</w:t>
       </w:r>
-      <w:hyperlink r:id="rId40">
+      <w:hyperlink r:id="rId34">
         <w:r>
           <w:rPr>
             <w:rStyle w:val="Hyperlink"/>
@@ -596,8 +743,8 @@
         </w:r>
       </w:hyperlink>
     </w:p>
-    <w:bookmarkEnd w:id="41"/>
-    <w:bookmarkStart w:id="43" w:name="Xedeb47b0dbf4551bbf1db9b9b53e7bd5f745362"/>
+    <w:bookmarkEnd w:id="35"/>
+    <w:bookmarkStart w:id="37" w:name="Xedeb47b0dbf4551bbf1db9b9b53e7bd5f745362"/>
     <w:p>
       <w:pPr>
         <w:pStyle w:val="Bibliography"/>
@@ -627,7 +774,7 @@
       <w:r>
         <w:t xml:space="preserve">. 2008;13(2):99-109. doi:</w:t>
       </w:r>
-      <w:hyperlink r:id="rId42">
+      <w:hyperlink r:id="rId36">
         <w:r>
           <w:rPr>
             <w:rStyle w:val="Hyperlink"/>
@@ -636,9 +783,9 @@
         </w:r>
       </w:hyperlink>
     </w:p>
-    <w:bookmarkEnd w:id="43"/>
-    <w:bookmarkEnd w:id="44"/>
-    <w:bookmarkEnd w:id="45"/>
+    <w:bookmarkEnd w:id="37"/>
+    <w:bookmarkEnd w:id="38"/>
+    <w:bookmarkEnd w:id="39"/>
     <w:sectPr>
       <w:footnotePr>
         <w:numRestart w:val="eachSect"/>
@@ -760,10 +907,10 @@
   <w:docDefaults>
     <w:rPrDefault>
       <w:rPr>
-        <w:rFonts w:asciiTheme="minorHAnsi" w:cstheme="minorBidi" w:eastAsiaTheme="minorHAnsi" w:hAnsiTheme="minorHAnsi"/>
+        <w:rFonts w:asciiTheme="minorHAnsi" w:cstheme="minorBidi" w:eastAsiaTheme="minorEastAsia" w:hAnsiTheme="minorHAnsi"/>
         <w:sz w:val="24"/>
         <w:szCs w:val="24"/>
-        <w:lang w:bidi="ar-SA" w:eastAsia="en-US" w:val="en-US"/>
+        <w:lang w:bidi="ar-SA" w:eastAsia="zh-CN" w:val="en-US"/>
       </w:rPr>
     </w:rPrDefault>
     <w:pPrDefault>
@@ -1304,13 +1451,6 @@
       </w:tblCellMar>
     </w:tblPr>
     <w:tblStylePr w:type="firstRow">
-      <w:tblPr>
-        <w:jc w:val="left"/>
-        <w:tblInd w:type="dxa" w:w="0"/>
-      </w:tblPr>
-      <w:trPr>
-        <w:jc w:val="left"/>
-      </w:trPr>
       <w:tcPr>
         <w:tcBorders>
           <w:bottom w:val="single"/>

</xml_diff>